<commit_message>
Update Embedded Systems - Final Project - G2.docx
</commit_message>
<xml_diff>
--- a/Documents/Embedded Systems - Final Project - G2.docx
+++ b/Documents/Embedded Systems - Final Project - G2.docx
@@ -13,7 +13,7 @@
           <w:b/>
           <w:bCs/>
         </w:rPr>
-        <w:t>Smart-Bin: Waste Management and Cleanliness</w:t>
+        <w:t>SMART-BIN: WASTE MANAGEMENT AND CLEANLINESS</w:t>
       </w:r>
     </w:p>
     <w:p>
@@ -34,20 +34,27 @@
     </w:p>
     <w:p>
       <w:pPr>
+        <w:rPr>
+          <w:b/>
+          <w:bCs/>
+        </w:rPr>
+      </w:pPr>
+    </w:p>
+    <w:p>
+      <w:pPr>
         <w:jc w:val="center"/>
         <w:rPr>
           <w:b/>
           <w:bCs/>
         </w:rPr>
       </w:pPr>
-    </w:p>
-    <w:p>
-      <w:pPr>
-        <w:rPr>
-          <w:b/>
-          <w:bCs/>
-        </w:rPr>
-      </w:pPr>
+      <w:r>
+        <w:rPr>
+          <w:b/>
+          <w:bCs/>
+        </w:rPr>
+        <w:t>Technological University of the Philippines Manila</w:t>
+      </w:r>
     </w:p>
     <w:p>
       <w:pPr>
@@ -62,6 +69,95 @@
           <w:b/>
           <w:bCs/>
         </w:rPr>
+        <w:t xml:space="preserve">Bachelor of Engineering Technology major in </w:t>
+      </w:r>
+      <w:r>
+        <w:rPr>
+          <w:b/>
+          <w:bCs/>
+        </w:rPr>
+        <w:t xml:space="preserve">Computer Engineering Technology </w:t>
+      </w:r>
+    </w:p>
+    <w:p>
+      <w:pPr>
+        <w:jc w:val="center"/>
+        <w:rPr>
+          <w:b/>
+          <w:bCs/>
+        </w:rPr>
+      </w:pPr>
+    </w:p>
+    <w:p>
+      <w:pPr>
+        <w:jc w:val="center"/>
+        <w:rPr>
+          <w:b/>
+          <w:bCs/>
+        </w:rPr>
+      </w:pPr>
+      <w:r>
+        <w:rPr>
+          <w:b/>
+          <w:bCs/>
+        </w:rPr>
+        <w:t>Embedded Systems: Final Project</w:t>
+      </w:r>
+    </w:p>
+    <w:p>
+      <w:pPr>
+        <w:jc w:val="center"/>
+        <w:rPr>
+          <w:b/>
+          <w:bCs/>
+        </w:rPr>
+      </w:pPr>
+      <w:r>
+        <w:rPr>
+          <w:b/>
+          <w:bCs/>
+        </w:rPr>
+        <w:t>BET-CPET 4A-M, Group 2</w:t>
+      </w:r>
+    </w:p>
+    <w:p>
+      <w:pPr>
+        <w:jc w:val="center"/>
+        <w:rPr>
+          <w:b/>
+          <w:bCs/>
+        </w:rPr>
+      </w:pPr>
+    </w:p>
+    <w:p>
+      <w:pPr>
+        <w:jc w:val="center"/>
+        <w:rPr>
+          <w:b/>
+          <w:bCs/>
+        </w:rPr>
+      </w:pPr>
+      <w:r>
+        <w:rPr>
+          <w:b/>
+          <w:bCs/>
+        </w:rPr>
+        <w:t>Submitted By:</w:t>
+      </w:r>
+    </w:p>
+    <w:p>
+      <w:pPr>
+        <w:jc w:val="center"/>
+        <w:rPr>
+          <w:b/>
+          <w:bCs/>
+        </w:rPr>
+      </w:pPr>
+      <w:r>
+        <w:rPr>
+          <w:b/>
+          <w:bCs/>
+        </w:rPr>
         <w:t>Brian Jay Celeste</w:t>
       </w:r>
     </w:p>
@@ -94,17 +190,8 @@
           <w:b/>
           <w:bCs/>
         </w:rPr>
-        <w:t xml:space="preserve">Jade C. </w:t>
-      </w:r>
-      <w:proofErr w:type="spellStart"/>
-      <w:r>
-        <w:rPr>
-          <w:b/>
-          <w:bCs/>
-        </w:rPr>
-        <w:t>Gunayan</w:t>
-      </w:r>
-      <w:proofErr w:type="spellEnd"/>
+        <w:t>Jade C. Gunayan</w:t>
+      </w:r>
     </w:p>
     <w:p>
       <w:pPr>
@@ -141,10 +228,6 @@
     <w:p>
       <w:pPr>
         <w:jc w:val="center"/>
-        <w:rPr>
-          <w:b/>
-          <w:bCs/>
-        </w:rPr>
       </w:pPr>
     </w:p>
     <w:p>
@@ -155,6 +238,13 @@
           <w:bCs/>
         </w:rPr>
       </w:pPr>
+      <w:r>
+        <w:rPr>
+          <w:b/>
+          <w:bCs/>
+        </w:rPr>
+        <w:t>Submitted To:</w:t>
+      </w:r>
     </w:p>
     <w:p>
       <w:pPr>
@@ -169,7 +259,7 @@
           <w:b/>
           <w:bCs/>
         </w:rPr>
-        <w:t>Computer Engineering Technology Department, Technological University of the Philippines Manila</w:t>
+        <w:t>Prof. Jonel R. Macalisang</w:t>
       </w:r>
     </w:p>
     <w:p>
@@ -180,70 +270,6 @@
           <w:bCs/>
         </w:rPr>
       </w:pPr>
-    </w:p>
-    <w:p>
-      <w:pPr>
-        <w:jc w:val="center"/>
-        <w:rPr>
-          <w:b/>
-          <w:bCs/>
-        </w:rPr>
-      </w:pPr>
-    </w:p>
-    <w:p>
-      <w:pPr>
-        <w:jc w:val="center"/>
-        <w:rPr>
-          <w:b/>
-          <w:bCs/>
-        </w:rPr>
-      </w:pPr>
-      <w:r>
-        <w:rPr>
-          <w:b/>
-          <w:bCs/>
-        </w:rPr>
-        <w:t>Embedded Systems: Final Project (BET-CPET 4A-M, Group 2)</w:t>
-      </w:r>
-    </w:p>
-    <w:p>
-      <w:pPr>
-        <w:jc w:val="center"/>
-      </w:pPr>
-    </w:p>
-    <w:p>
-      <w:pPr>
-        <w:jc w:val="center"/>
-        <w:rPr>
-          <w:b/>
-          <w:bCs/>
-        </w:rPr>
-      </w:pPr>
-    </w:p>
-    <w:p>
-      <w:pPr>
-        <w:jc w:val="center"/>
-        <w:rPr>
-          <w:b/>
-          <w:bCs/>
-        </w:rPr>
-      </w:pPr>
-      <w:r>
-        <w:rPr>
-          <w:b/>
-          <w:bCs/>
-        </w:rPr>
-        <w:t xml:space="preserve">Prof. Jonel R. </w:t>
-      </w:r>
-      <w:proofErr w:type="spellStart"/>
-      <w:r>
-        <w:rPr>
-          <w:b/>
-          <w:bCs/>
-        </w:rPr>
-        <w:t>Macalisang</w:t>
-      </w:r>
-      <w:proofErr w:type="spellEnd"/>
     </w:p>
     <w:p>
       <w:pPr>

</xml_diff>